<commit_message>
fix: Corrige autenticação com sessionStorage em todas as páginas
</commit_message>
<xml_diff>
--- a/Sprint/Sprints/Sprint Planning 8.docx
+++ b/Sprint/Sprints/Sprint Planning 8.docx
@@ -1667,6 +1667,14 @@
           <w:szCs w:val="24"/>
         </w:rPr>
         <w:t xml:space="preserve"> (exportação de relatórios)</w:t>
+      </w:r>
+      <w:r>
+        <w:rPr>
+          <w:rFonts w:ascii="Calibri Light" w:hAnsi="Calibri Light" w:cs="Calibri Light"/>
+          <w:sz w:val="24"/>
+          <w:szCs w:val="24"/>
+        </w:rPr>
+        <w:tab/>
       </w:r>
     </w:p>
     <w:p>
@@ -9098,6 +9106,7 @@
   <w:style w:type="character" w:default="1" w:styleId="Fontepargpadro">
     <w:name w:val="Default Paragraph Font"/>
     <w:uiPriority w:val="1"/>
+    <w:semiHidden/>
     <w:unhideWhenUsed/>
   </w:style>
   <w:style w:type="table" w:default="1" w:styleId="Tabelanormal">

</xml_diff>